<commit_message>
Update white-label plan: apex/www resolved, re-rank levers
Apex/www canonicalisation is done, so drop it as a lever. Master plan
roadmap re-ranked: Phase 0 shrinks to meta-keywords + schema; Tier-A CTR
revamp + hub rebuild becomes the #1 lever (~721k impressions). Redirect
map Data-findings tab reframes apex/www as resolved and notes tiers are
the consolidated single-URL view; excludes chatbot impressions from the
CTR-lift forecast.

Co-Authored-By: Claude Opus 4.8 <noreply@anthropic.com>
Claude-Session: https://claude.ai/code/session_01UhVChLeNNjFDr6eASTMGhh
</commit_message>
<xml_diff>
--- a/seo-audit/Trillet-WhiteLabel-Master-Plan.docx
+++ b/seo-audit/Trillet-WhiteLabel-Master-Plan.docx
@@ -1294,7 +1294,7 @@
           <w:sz w:val="19"/>
           <w:szCs w:val="19"/>
         </w:rPr>
-        <w:t xml:space="preserve">Apex ↔ www split + meta-keywords leak. </w:t>
+        <w:t xml:space="preserve">Meta-keywords leak (apex/www now resolved). </w:t>
       </w:r>
       <w:r>
         <w:rPr>
@@ -1307,7 +1307,7 @@
           <w:sz w:val="19"/>
           <w:szCs w:val="19"/>
         </w:rPr>
-        <w:t xml:space="preserve">The site-wide technical issues from the audit apply across the cluster.</w:t>
+        <w:t xml:space="preserve">Host duplication has been canonicalised — no longer a lever; expect consolidated pages to firm up over 4–8 weeks. The remaining site-wide technical issue is the Australia meta-keywords block. With host duplication fixed, the CTR/snippet failure is the primary problem.</w:t>
       </w:r>
     </w:p>
     <w:p>
@@ -3965,6 +3965,22 @@
     </w:p>
     <w:p>
       <w:pPr>
+        <w:spacing w:after="90"/>
+      </w:pPr>
+      <w:r>
+        <w:rPr>
+          <w:rFonts w:ascii="Calibri" w:cs="Calibri" w:eastAsia="Calibri" w:hAnsi="Calibri"/>
+          <w:i w:val="false"/>
+          <w:iCs w:val="false"/>
+          <w:color w:val="5A6675"/>
+          <w:sz w:val="18"/>
+          <w:szCs w:val="18"/>
+        </w:rPr>
+        <w:t xml:space="preserve">Apex/www canonicalisation — previously the #1 item — is DONE. With it resolved, the CTR/snippet revamp of the ~93 Tier-A pages (~721k impressions) is the single biggest remaining lever, so it moves up.</w:t>
+      </w:r>
+    </w:p>
+    <w:p>
+      <w:pPr>
         <w:spacing w:after="60"/>
       </w:pPr>
       <w:r>
@@ -3996,7 +4012,7 @@
           <w:sz w:val="19"/>
           <w:szCs w:val="19"/>
         </w:rPr>
-        <w:t xml:space="preserve">apex/www canonical, meta-keywords removal, schema on money pages. Nothing compounds without this.</w:t>
+        <w:t xml:space="preserve">meta-keywords removal + schema on money pages (SoftwareApplication/Offer/FAQPage). Quick — apex/www already done.</w:t>
       </w:r>
     </w:p>
     <w:p>
@@ -4023,7 +4039,7 @@
           <w:sz w:val="19"/>
           <w:szCs w:val="19"/>
         </w:rPr>
-        <w:t xml:space="preserve">Phase 1 — Architecture &amp; hubs — </w:t>
+        <w:t xml:space="preserve">Phase 1 — Hub rebuild + CTR revamp (biggest lever) — </w:t>
       </w:r>
       <w:r>
         <w:rPr>
@@ -4032,7 +4048,7 @@
           <w:sz w:val="19"/>
           <w:szCs w:val="19"/>
         </w:rPr>
-        <w:t xml:space="preserve">rebuild /whitelabel; build the 4 hub/index pages; wire hub↔spoke internal links.</w:t>
+        <w:t xml:space="preserve">rebuild /whitelabel as the pillar AND rewrite titles/metas/snippets on the Tier-A pages (start with voice-ai-white-label-pricing-breakdown, 42k impr @0.06%). This is where the 721k impressions convert.</w:t>
       </w:r>
     </w:p>
     <w:p>
@@ -4068,7 +4084,7 @@
           <w:sz w:val="19"/>
           <w:szCs w:val="19"/>
         </w:rPr>
-        <w:t xml:space="preserve">execute the merge/redirect table; make the chatbot decision; dedupe competitor pages.</w:t>
+        <w:t xml:space="preserve">execute the merge/redirect table; make the chatbot decision (redirect the chatbot-query pages you can’t convert); dedupe competitor pages.</w:t>
       </w:r>
     </w:p>
     <w:p>
@@ -4095,7 +4111,7 @@
           <w:sz w:val="19"/>
           <w:szCs w:val="19"/>
         </w:rPr>
-        <w:t xml:space="preserve">Phase 3 — CTR revamp — </w:t>
+        <w:t xml:space="preserve">Phase 3 — Architecture &amp; hubs — </w:t>
       </w:r>
       <w:r>
         <w:rPr>
@@ -4104,7 +4120,7 @@
           <w:sz w:val="19"/>
           <w:szCs w:val="19"/>
         </w:rPr>
-        <w:t xml:space="preserve">rewrite titles/metas/snippets on high-impression posts, starting with the 46k pricing post.</w:t>
+        <w:t xml:space="preserve">build the 4 hub/index pages; wire hub↔spoke internal links (lifts white-label-ai-receptionist, the 2.39%-CTR term, off page 2).</w:t>
       </w:r>
     </w:p>
     <w:p>
@@ -4203,7 +4219,7 @@
           <w:sz w:val="19"/>
           <w:szCs w:val="19"/>
         </w:rPr>
-        <w:t xml:space="preserve">Ongoing — Governance — </w:t>
+        <w:t xml:space="preserve">Ongoing — Governance &amp; measurement — </w:t>
       </w:r>
       <w:r>
         <w:rPr>
@@ -4212,7 +4228,7 @@
           <w:sz w:val="19"/>
           <w:szCs w:val="19"/>
         </w:rPr>
-        <w:t xml:space="preserve">freeze sprawl, measure by cluster, prune quarterly.</w:t>
+        <w:t xml:space="preserve">freeze sprawl, measure by cluster, prune quarterly, and re-pull GSC in 4–8 weeks to confirm the apex/www consolidation lift and re-tier.</w:t>
       </w:r>
     </w:p>
     <w:p>

</xml_diff>